<commit_message>
edited report and added requirements.txt
</commit_message>
<xml_diff>
--- a/Lab02_Python_M_PIN_RIS_2607_Bogdanov Nikita.docx
+++ b/Lab02_Python_M_PIN_RIS_2607_Bogdanov Nikita.docx
@@ -237,7 +237,6 @@
           <w:rFonts w:ascii="Times New Roman" w:eastAsia="WenQuanYi Micro Hei" w:hAnsi="Times New Roman" w:cs="Times New Roman"/>
           <w:sz w:val="28"/>
           <w:szCs w:val="28"/>
-          <w:lang w:val="en-US"/>
         </w:rPr>
       </w:pPr>
       <w:r>
@@ -255,7 +254,6 @@
           <w:b/>
           <w:sz w:val="28"/>
           <w:szCs w:val="28"/>
-          <w:lang w:val="en-US"/>
         </w:rPr>
         <w:t>2</w:t>
       </w:r>
@@ -753,6 +751,14 @@
     </w:p>
     <w:sdt>
       <w:sdtPr>
+        <w:rPr>
+          <w:rFonts w:ascii="Liberation Serif" w:eastAsia="NSimSun" w:hAnsi="Liberation Serif" w:cs="Lucida Sans"/>
+          <w:color w:val="auto"/>
+          <w:kern w:val="2"/>
+          <w:sz w:val="24"/>
+          <w:szCs w:val="24"/>
+          <w:lang w:eastAsia="zh-CN" w:bidi="hi-IN"/>
+        </w:rPr>
         <w:id w:val="2053726974"/>
         <w:docPartObj>
           <w:docPartGallery w:val="Table of Contents"/>
@@ -761,14 +767,8 @@
       </w:sdtPr>
       <w:sdtEndPr>
         <w:rPr>
-          <w:rFonts w:ascii="Liberation Serif" w:eastAsia="NSimSun" w:hAnsi="Liberation Serif" w:cs="Lucida Sans"/>
           <w:b/>
           <w:bCs/>
-          <w:color w:val="auto"/>
-          <w:kern w:val="2"/>
-          <w:sz w:val="24"/>
-          <w:szCs w:val="24"/>
-          <w:lang w:eastAsia="zh-CN" w:bidi="hi-IN"/>
         </w:rPr>
       </w:sdtEndPr>
       <w:sdtContent>
@@ -787,6 +787,7 @@
               <w:tab w:val="right" w:leader="dot" w:pos="9345"/>
             </w:tabs>
             <w:rPr>
+              <w:rFonts w:hint="eastAsia"/>
               <w:noProof/>
             </w:rPr>
           </w:pPr>
@@ -848,7 +849,6 @@
             </w:r>
             <w:r>
               <w:rPr>
-                <w:rFonts w:hint="eastAsia"/>
                 <w:noProof/>
                 <w:webHidden/>
               </w:rPr>
@@ -878,6 +878,7 @@
               <w:tab w:val="right" w:leader="dot" w:pos="9345"/>
             </w:tabs>
             <w:rPr>
+              <w:rFonts w:hint="eastAsia"/>
               <w:noProof/>
             </w:rPr>
           </w:pPr>
@@ -918,7 +919,6 @@
             </w:r>
             <w:r>
               <w:rPr>
-                <w:rFonts w:hint="eastAsia"/>
                 <w:noProof/>
                 <w:webHidden/>
               </w:rPr>
@@ -948,6 +948,7 @@
               <w:tab w:val="right" w:leader="dot" w:pos="9345"/>
             </w:tabs>
             <w:rPr>
+              <w:rFonts w:hint="eastAsia"/>
               <w:noProof/>
             </w:rPr>
           </w:pPr>
@@ -988,7 +989,6 @@
             </w:r>
             <w:r>
               <w:rPr>
-                <w:rFonts w:hint="eastAsia"/>
                 <w:noProof/>
                 <w:webHidden/>
               </w:rPr>
@@ -1018,6 +1018,7 @@
               <w:tab w:val="right" w:leader="dot" w:pos="9345"/>
             </w:tabs>
             <w:rPr>
+              <w:rFonts w:hint="eastAsia"/>
               <w:noProof/>
             </w:rPr>
           </w:pPr>
@@ -1058,7 +1059,6 @@
             </w:r>
             <w:r>
               <w:rPr>
-                <w:rFonts w:hint="eastAsia"/>
                 <w:noProof/>
                 <w:webHidden/>
               </w:rPr>
@@ -1088,6 +1088,7 @@
               <w:tab w:val="right" w:leader="dot" w:pos="9345"/>
             </w:tabs>
             <w:rPr>
+              <w:rFonts w:hint="eastAsia"/>
               <w:noProof/>
             </w:rPr>
           </w:pPr>
@@ -1128,7 +1129,6 @@
             </w:r>
             <w:r>
               <w:rPr>
-                <w:rFonts w:hint="eastAsia"/>
                 <w:noProof/>
                 <w:webHidden/>
               </w:rPr>
@@ -1158,6 +1158,7 @@
               <w:tab w:val="right" w:leader="dot" w:pos="9345"/>
             </w:tabs>
             <w:rPr>
+              <w:rFonts w:hint="eastAsia"/>
               <w:noProof/>
             </w:rPr>
           </w:pPr>
@@ -1198,7 +1199,6 @@
             </w:r>
             <w:r>
               <w:rPr>
-                <w:rFonts w:hint="eastAsia"/>
                 <w:noProof/>
                 <w:webHidden/>
               </w:rPr>
@@ -1228,6 +1228,7 @@
               <w:tab w:val="right" w:leader="dot" w:pos="9345"/>
             </w:tabs>
             <w:rPr>
+              <w:rFonts w:hint="eastAsia"/>
               <w:noProof/>
             </w:rPr>
           </w:pPr>
@@ -1268,7 +1269,6 @@
             </w:r>
             <w:r>
               <w:rPr>
-                <w:rFonts w:hint="eastAsia"/>
                 <w:noProof/>
                 <w:webHidden/>
               </w:rPr>
@@ -1298,6 +1298,7 @@
               <w:tab w:val="right" w:leader="dot" w:pos="9345"/>
             </w:tabs>
             <w:rPr>
+              <w:rFonts w:hint="eastAsia"/>
               <w:noProof/>
             </w:rPr>
           </w:pPr>
@@ -1338,7 +1339,6 @@
             </w:r>
             <w:r>
               <w:rPr>
-                <w:rFonts w:hint="eastAsia"/>
                 <w:noProof/>
                 <w:webHidden/>
               </w:rPr>
@@ -1368,6 +1368,7 @@
               <w:tab w:val="right" w:leader="dot" w:pos="9345"/>
             </w:tabs>
             <w:rPr>
+              <w:rFonts w:hint="eastAsia"/>
               <w:noProof/>
             </w:rPr>
           </w:pPr>
@@ -1423,7 +1424,6 @@
             </w:r>
             <w:r>
               <w:rPr>
-                <w:rFonts w:hint="eastAsia"/>
                 <w:noProof/>
                 <w:webHidden/>
               </w:rPr>
@@ -1447,6 +1447,11 @@
           </w:hyperlink>
         </w:p>
         <w:p>
+          <w:pPr>
+            <w:rPr>
+              <w:rFonts w:hint="eastAsia"/>
+            </w:rPr>
+          </w:pPr>
           <w:r>
             <w:rPr>
               <w:b/>
@@ -1721,20 +1726,21 @@
         <w:tabs>
           <w:tab w:val="left" w:pos="1665"/>
         </w:tabs>
-      </w:pPr>
-      <w:bookmarkStart w:id="0" w:name="_GoBack"/>
-      <w:bookmarkEnd w:id="0"/>
+        <w:rPr>
+          <w:rFonts w:hint="eastAsia"/>
+        </w:rPr>
+      </w:pPr>
     </w:p>
     <w:p>
       <w:pPr>
         <w:pStyle w:val="1"/>
       </w:pPr>
-      <w:bookmarkStart w:id="1" w:name="_Toc242359386"/>
+      <w:bookmarkStart w:id="0" w:name="_Toc242359386"/>
       <w:r>
         <w:lastRenderedPageBreak/>
         <w:t>Цель работы</w:t>
       </w:r>
-      <w:bookmarkEnd w:id="1"/>
+      <w:bookmarkEnd w:id="0"/>
     </w:p>
     <w:p>
       <w:pPr>
@@ -1898,14 +1904,14 @@
       <w:pPr>
         <w:pStyle w:val="1"/>
       </w:pPr>
-      <w:bookmarkStart w:id="2" w:name="_Toc242359387"/>
+      <w:bookmarkStart w:id="1" w:name="_Toc242359387"/>
       <w:r>
         <w:t>Задание (Вариант 3</w:t>
       </w:r>
       <w:r>
         <w:t>)</w:t>
       </w:r>
-      <w:bookmarkEnd w:id="2"/>
+      <w:bookmarkEnd w:id="1"/>
     </w:p>
     <w:p>
       <w:pPr>
@@ -2206,22 +2212,22 @@
       <w:r>
         <w:br w:type="column"/>
       </w:r>
-      <w:bookmarkStart w:id="3" w:name="_Toc242359388"/>
+      <w:bookmarkStart w:id="2" w:name="_Toc242359388"/>
       <w:r>
         <w:lastRenderedPageBreak/>
         <w:t>Ход работы и описание реализации</w:t>
       </w:r>
+      <w:bookmarkEnd w:id="2"/>
+    </w:p>
+    <w:p>
+      <w:pPr>
+        <w:pStyle w:val="2"/>
+      </w:pPr>
+      <w:bookmarkStart w:id="3" w:name="_Toc242359389"/>
+      <w:r>
+        <w:t>Шаг 0: Подготовка исходных данных</w:t>
+      </w:r>
       <w:bookmarkEnd w:id="3"/>
-    </w:p>
-    <w:p>
-      <w:pPr>
-        <w:pStyle w:val="2"/>
-      </w:pPr>
-      <w:bookmarkStart w:id="4" w:name="_Toc242359389"/>
-      <w:r>
-        <w:t>Шаг 0: Подготовка исходных данных</w:t>
-      </w:r>
-      <w:bookmarkEnd w:id="4"/>
     </w:p>
     <w:p>
       <w:pPr>
@@ -2417,11 +2423,11 @@
       <w:pPr>
         <w:pStyle w:val="2"/>
       </w:pPr>
-      <w:bookmarkStart w:id="5" w:name="_Toc242359390"/>
+      <w:bookmarkStart w:id="4" w:name="_Toc242359390"/>
       <w:r>
         <w:t>Модульная структура проекта</w:t>
       </w:r>
-      <w:bookmarkEnd w:id="5"/>
+      <w:bookmarkEnd w:id="4"/>
     </w:p>
     <w:p>
       <w:pPr>
@@ -2755,11 +2761,11 @@
       <w:pPr>
         <w:pStyle w:val="2"/>
       </w:pPr>
-      <w:bookmarkStart w:id="6" w:name="_Toc242359391"/>
+      <w:bookmarkStart w:id="5" w:name="_Toc242359391"/>
       <w:r>
         <w:t>Реализация пунктов задания</w:t>
       </w:r>
-      <w:bookmarkEnd w:id="6"/>
+      <w:bookmarkEnd w:id="5"/>
     </w:p>
     <w:p>
       <w:pPr>
@@ -4048,12 +4054,12 @@
       <w:r>
         <w:br w:type="column"/>
       </w:r>
-      <w:bookmarkStart w:id="7" w:name="_Toc242359392"/>
+      <w:bookmarkStart w:id="6" w:name="_Toc242359392"/>
       <w:r>
         <w:lastRenderedPageBreak/>
         <w:t>Результаты работы</w:t>
       </w:r>
-      <w:bookmarkEnd w:id="7"/>
+      <w:bookmarkEnd w:id="6"/>
     </w:p>
     <w:p>
       <w:pPr>
@@ -4391,11 +4397,11 @@
       <w:pPr>
         <w:pStyle w:val="1"/>
       </w:pPr>
-      <w:bookmarkStart w:id="8" w:name="_Toc242359393"/>
+      <w:bookmarkStart w:id="7" w:name="_Toc242359393"/>
       <w:r>
         <w:t>Вывод</w:t>
       </w:r>
-      <w:bookmarkEnd w:id="8"/>
+      <w:bookmarkEnd w:id="7"/>
     </w:p>
     <w:p>
       <w:pPr>
@@ -4546,7 +4552,25 @@
           <w:sz w:val="28"/>
           <w:szCs w:val="28"/>
         </w:rPr>
-        <w:t>). Реализация итераторов обеспечивает удобный, инкапсулированный и безопасный способ последовательного доступа к экземплярам классов без их повторения, что полностью соответствует требованиям варианта 3–7. Код готов к расширению и повторному использованию в последующих лабораторных работах.</w:t>
+        <w:t>). Реализация итераторов обеспечивает удобный, инкапсулированный и безопасный способ последовательного доступа к экземплярам классов без их повторения, что полностью соотве</w:t>
+      </w:r>
+      <w:r>
+        <w:rPr>
+          <w:rFonts w:ascii="Times New Roman" w:hAnsi="Times New Roman" w:cs="Times New Roman"/>
+          <w:sz w:val="28"/>
+          <w:szCs w:val="28"/>
+        </w:rPr>
+        <w:t>тствует требованиям варианта 3</w:t>
+      </w:r>
+      <w:bookmarkStart w:id="8" w:name="_GoBack"/>
+      <w:bookmarkEnd w:id="8"/>
+      <w:r>
+        <w:rPr>
+          <w:rFonts w:ascii="Times New Roman" w:hAnsi="Times New Roman" w:cs="Times New Roman"/>
+          <w:sz w:val="28"/>
+          <w:szCs w:val="28"/>
+        </w:rPr>
+        <w:t>. Код готов к расширению и повторному использованию в последующих лабораторных работах.</w:t>
       </w:r>
     </w:p>
     <w:p>
@@ -4557,6 +4581,9 @@
         </w:rPr>
       </w:pPr>
       <w:r>
+        <w:rPr>
+          <w:lang w:val="en-US"/>
+        </w:rPr>
         <w:br w:type="column"/>
       </w:r>
       <w:bookmarkStart w:id="9" w:name="_Toc242359394"/>
@@ -15024,6 +15051,7 @@
           <w:rFonts w:ascii="Times New Roman" w:hAnsi="Times New Roman" w:cs="Times New Roman"/>
           <w:sz w:val="28"/>
           <w:szCs w:val="28"/>
+          <w:lang w:val="en-US"/>
         </w:rPr>
       </w:pPr>
       <w:r>
@@ -15041,6 +15069,7 @@
           <w:rFonts w:ascii="Times New Roman" w:hAnsi="Times New Roman" w:cs="Times New Roman"/>
           <w:sz w:val="28"/>
           <w:szCs w:val="28"/>
+          <w:lang w:val="en-US"/>
         </w:rPr>
         <w:t>target_path</w:t>
       </w:r>
@@ -15050,6 +15079,7 @@
           <w:rFonts w:ascii="Times New Roman" w:hAnsi="Times New Roman" w:cs="Times New Roman"/>
           <w:sz w:val="28"/>
           <w:szCs w:val="28"/>
+          <w:lang w:val="en-US"/>
         </w:rPr>
         <w:t xml:space="preserve">, </w:t>
       </w:r>
@@ -15059,6 +15089,7 @@
           <w:rFonts w:ascii="Times New Roman" w:hAnsi="Times New Roman" w:cs="Times New Roman"/>
           <w:sz w:val="28"/>
           <w:szCs w:val="28"/>
+          <w:lang w:val="en-US"/>
         </w:rPr>
         <w:t>project_dir</w:t>
       </w:r>
@@ -23010,6 +23041,7 @@
           <w:tab w:val="left" w:pos="1665"/>
         </w:tabs>
         <w:rPr>
+          <w:rFonts w:hint="eastAsia"/>
           <w:lang w:val="en-US"/>
         </w:rPr>
       </w:pPr>
@@ -24953,6 +24985,7 @@
   <w:style w:type="character" w:default="1" w:styleId="a0">
     <w:name w:val="Default Paragraph Font"/>
     <w:uiPriority w:val="1"/>
+    <w:semiHidden/>
     <w:unhideWhenUsed/>
   </w:style>
   <w:style w:type="table" w:default="1" w:styleId="a1">
@@ -25353,7 +25386,7 @@
 </file>
 
 <file path=customXml/itemProps1.xml><?xml version="1.0" encoding="utf-8"?>
-<ds:datastoreItem xmlns:ds="http://schemas.openxmlformats.org/officeDocument/2006/customXml" ds:itemID="{737154F0-625B-4EA6-A672-994D6008B96E}">
+<ds:datastoreItem xmlns:ds="http://schemas.openxmlformats.org/officeDocument/2006/customXml" ds:itemID="{E880A74F-D260-40EB-9066-A1575ECAC4E4}">
   <ds:schemaRefs>
     <ds:schemaRef ds:uri="http://schemas.openxmlformats.org/officeDocument/2006/bibliography"/>
   </ds:schemaRefs>

</xml_diff>